<commit_message>
docs: Ch7-Ch9 修訂 + 初稿IV 排版更新 + Meeting23 簡報
- 謝辭/中英摘要：instance-based → KNN 文字修正
- Ch7 討論：§7.5.2 T1 假說補充
- Ch8 結論 pandoc docx 更新
- Ch9 參考文獻：IEEE 格式修訂（74 行變更）
- 初稿IV docx/pdf 最新排版輸出
- Turnitin 報告更新
- 新增 Meeting23 簡報

Co-Authored-By: Claude Opus 4.6 <noreply@anthropic.com>
</commit_message>
<xml_diff>
--- a/docs/00_thesis/chapters/07_第七章_討論.docx
+++ b/docs/00_thesis/chapters/07_第七章_討論.docx
@@ -2,7 +2,7 @@
 <file path=word/document.xml><?xml version="1.0" encoding="utf-8"?>
 <w:document xmlns:w="http://schemas.openxmlformats.org/wordprocessingml/2006/main" xmlns:m="http://schemas.openxmlformats.org/officeDocument/2006/math" xmlns:r="http://schemas.openxmlformats.org/officeDocument/2006/relationships" xmlns:o="urn:schemas-microsoft-com:office:office" xmlns:v="urn:schemas-microsoft-com:vml" xmlns:w10="urn:schemas-microsoft-com:office:word" xmlns:a="http://schemas.openxmlformats.org/drawingml/2006/main" xmlns:pic="http://schemas.openxmlformats.org/drawingml/2006/picture" xmlns:wp="http://schemas.openxmlformats.org/drawingml/2006/wordprocessingDrawing">
   <w:body>
-    <w:bookmarkStart w:id="37" w:name="第七章-討論"/>
+    <w:bookmarkStart w:id="40" w:name="第七章-討論"/>
     <w:p>
       <w:pPr>
         <w:pStyle w:val="1"/>
@@ -102,7 +102,7 @@
         <w:t xml:space="preserve">平衡良好，適合作為臨床應用的基準模型。此結果與</w:t>
       </w:r>
       <w:r>
-        <w:t xml:space="preserve"> Sun et al. (2017) </w:t>
+        <w:t xml:space="preserve"> Sun et al. [23] </w:t>
       </w:r>
       <w:r>
         <w:rPr>
@@ -972,7 +972,43 @@
         <w:rPr>
           <w:rFonts w:hint="eastAsia"/>
         </w:rPr>
-        <w:t xml:space="preserve">隨健檢次數遞增的趨勢一致。</w:t>
+        <w:t xml:space="preserve">隨健檢次數遞增的趨勢一致。補充比較中</w:t>
+      </w:r>
+      <w:r>
+        <w:t xml:space="preserve"> Y-1-Only </w:t>
+      </w:r>
+      <w:r>
+        <w:rPr>
+          <w:rFonts w:hint="eastAsia"/>
+        </w:rPr>
+        <w:t xml:space="preserve">在高血糖（0.923</w:t>
+      </w:r>
+      <w:r>
+        <w:t xml:space="preserve"> vs </w:t>
+      </w:r>
+      <w:r>
+        <w:rPr>
+          <w:rFonts w:hint="eastAsia"/>
+        </w:rPr>
+        <w:t xml:space="preserve">0.889）與高血脂（0.846</w:t>
+      </w:r>
+      <w:r>
+        <w:t xml:space="preserve"> vs </w:t>
+      </w:r>
+      <w:r>
+        <w:rPr>
+          <w:rFonts w:hint="eastAsia"/>
+        </w:rPr>
+        <w:t xml:space="preserve">0.814）均優於</w:t>
+      </w:r>
+      <w:r>
+        <w:t xml:space="preserve"> </w:t>
+      </w:r>
+      <w:r>
+        <w:rPr>
+          <w:rFonts w:hint="eastAsia"/>
+        </w:rPr>
+        <w:t xml:space="preserve">Y-2-Only，直接驗證較近時間點的資料預測力較高。</w:t>
       </w:r>
     </w:p>
     <w:p>
@@ -1134,7 +1170,7 @@
         <w:t xml:space="preserve">此發現與</w:t>
       </w:r>
       <w:r>
-        <w:t xml:space="preserve"> Kanegae et al. (2020) </w:t>
+        <w:t xml:space="preserve"> Kanegae et al. [9] </w:t>
       </w:r>
       <w:r>
         <w:rPr>
@@ -1231,6 +1267,110 @@
           <w:rFonts w:hint="eastAsia"/>
         </w:rPr>
         <w:t xml:space="preserve">特徵的核心價值在於提升臨床可解釋性而非預測效能。</w:t>
+      </w:r>
+    </w:p>
+    <w:p>
+      <w:pPr>
+        <w:pStyle w:val="Compact"/>
+        <w:numPr>
+          <w:ilvl w:val="0"/>
+          <w:numId w:val="1002"/>
+        </w:numPr>
+      </w:pPr>
+      <w:r>
+        <w:rPr>
+          <w:rFonts w:hint="eastAsia"/>
+          <w:b/>
+          <w:bCs/>
+        </w:rPr>
+        <w:t xml:space="preserve">變化方向的預測局限</w:t>
+      </w:r>
+      <w:r>
+        <w:rPr>
+          <w:rFonts w:hint="eastAsia"/>
+        </w:rPr>
+        <w:t xml:space="preserve">：Δ-Only</w:t>
+      </w:r>
+      <w:r>
+        <w:t xml:space="preserve"> </w:t>
+      </w:r>
+      <w:r>
+        <w:rPr>
+          <w:rFonts w:hint="eastAsia"/>
+        </w:rPr>
+        <w:t xml:space="preserve">實驗（僅使用變化量特徵，不含任何靜態數值）的</w:t>
+      </w:r>
+      <w:r>
+        <w:t xml:space="preserve"> AUC </w:t>
+      </w:r>
+      <w:r>
+        <w:rPr>
+          <w:rFonts w:hint="eastAsia"/>
+        </w:rPr>
+        <w:t xml:space="preserve">顯著低於其他實驗組（高血壓</w:t>
+      </w:r>
+      <w:r>
+        <w:t xml:space="preserve"> </w:t>
+      </w:r>
+      <w:r>
+        <w:rPr>
+          <w:rFonts w:hint="eastAsia"/>
+        </w:rPr>
+        <w:t xml:space="preserve">0.593、高血糖</w:t>
+      </w:r>
+      <w:r>
+        <w:t xml:space="preserve"> </w:t>
+      </w:r>
+      <w:r>
+        <w:rPr>
+          <w:rFonts w:hint="eastAsia"/>
+        </w:rPr>
+        <w:t xml:space="preserve">0.668、高血脂</w:t>
+      </w:r>
+      <w:r>
+        <w:t xml:space="preserve"> </w:t>
+      </w:r>
+      <w:r>
+        <w:rPr>
+          <w:rFonts w:hint="eastAsia"/>
+        </w:rPr>
+        <w:t xml:space="preserve">0.636），顯示變化方向本身缺乏獨立預測力——僅知道血糖「上升了</w:t>
+      </w:r>
+      <w:r>
+        <w:t xml:space="preserve"> 5 </w:t>
+      </w:r>
+      <w:r>
+        <w:rPr>
+          <w:rFonts w:hint="eastAsia"/>
+        </w:rPr>
+        <w:t xml:space="preserve">mg/dL」而不知基線為</w:t>
+      </w:r>
+      <w:r>
+        <w:t xml:space="preserve"> 80 </w:t>
+      </w:r>
+      <w:r>
+        <w:rPr>
+          <w:rFonts w:hint="eastAsia"/>
+        </w:rPr>
+        <w:t xml:space="preserve">或</w:t>
+      </w:r>
+      <w:r>
+        <w:t xml:space="preserve"> </w:t>
+      </w:r>
+      <w:r>
+        <w:rPr>
+          <w:rFonts w:hint="eastAsia"/>
+        </w:rPr>
+        <w:t xml:space="preserve">120，風險判讀截然不同。此結果進一步確認</w:t>
+      </w:r>
+      <w:r>
+        <w:t xml:space="preserve"> Δ </w:t>
+      </w:r>
+      <w:r>
+        <w:rPr>
+          <w:rFonts w:hint="eastAsia"/>
+        </w:rPr>
+        <w:t xml:space="preserve">特徵的角色定位：其價值在於結合絕對值提供縱向趨勢資訊與臨床可解釋性，而非替代靜態生物標記。</w:t>
       </w:r>
     </w:p>
     <w:bookmarkEnd w:id="25"/>
@@ -1287,13 +1427,13 @@
         <w:t xml:space="preserve">降幅皆在</w:t>
       </w:r>
       <w:r>
-        <w:t xml:space="preserve"> 1.5% </w:t>
-      </w:r>
-      <w:r>
-        <w:rPr>
-          <w:rFonts w:hint="eastAsia"/>
-        </w:rPr>
-        <w:t xml:space="preserve">以內（高血糖甚至無降幅）。進一步精簡至</w:t>
+        <w:t xml:space="preserve"> 1% </w:t>
+      </w:r>
+      <w:r>
+        <w:rPr>
+          <w:rFonts w:hint="eastAsia"/>
+        </w:rPr>
+        <w:t xml:space="preserve">以內。進一步精簡至</w:t>
       </w:r>
       <w:r>
         <w:t xml:space="preserve"> Top 5 </w:t>
@@ -1311,7 +1451,7 @@
         <w:rPr>
           <w:rFonts w:hint="eastAsia"/>
         </w:rPr>
-        <w:t xml:space="preserve">降幅小於</w:t>
+        <w:t xml:space="preserve">降幅不超過</w:t>
       </w:r>
       <w:r>
         <w:t xml:space="preserve"> 0.5%。XGBoost </w:t>
@@ -1464,7 +1604,7 @@
         <w:rPr>
           <w:rFonts w:hint="eastAsia"/>
         </w:rPr>
-        <w:t xml:space="preserve">0.74-0.85，適合疾病篩檢應用。</w:t>
+        <w:t xml:space="preserve">0.70-0.86，適合疾病篩檢應用。</w:t>
       </w:r>
     </w:p>
     <w:bookmarkEnd w:id="28"/>
@@ -1615,7 +1755,7 @@
       <w:pPr>
         <w:numPr>
           <w:ilvl w:val="0"/>
-          <w:numId w:val="1002"/>
+          <w:numId w:val="1003"/>
         </w:numPr>
       </w:pPr>
       <w:r>
@@ -1717,7 +1857,7 @@
       <w:pPr>
         <w:numPr>
           <w:ilvl w:val="0"/>
-          <w:numId w:val="1002"/>
+          <w:numId w:val="1003"/>
         </w:numPr>
       </w:pPr>
       <w:r>
@@ -1801,7 +1941,7 @@
       <w:pPr>
         <w:numPr>
           <w:ilvl w:val="0"/>
-          <w:numId w:val="1002"/>
+          <w:numId w:val="1003"/>
         </w:numPr>
       </w:pPr>
       <w:r>
@@ -1961,7 +2101,7 @@
     </w:p>
     <w:bookmarkEnd w:id="32"/>
     <w:bookmarkEnd w:id="33"/>
-    <w:bookmarkStart w:id="34" w:name="縱向資料的累積效益"/>
+    <w:bookmarkStart w:id="37" w:name="縱向資料的累積效益"/>
     <w:p>
       <w:pPr>
         <w:pStyle w:val="2"/>
@@ -1976,6 +2116,21 @@
         <w:t xml:space="preserve">縱向資料的累積效益</w:t>
       </w:r>
     </w:p>
+    <w:bookmarkStart w:id="34" w:name="健檢次數的影響"/>
+    <w:p>
+      <w:pPr>
+        <w:pStyle w:val="3"/>
+      </w:pPr>
+      <w:r>
+        <w:t xml:space="preserve">7.5.1 </w:t>
+      </w:r>
+      <w:r>
+        <w:rPr>
+          <w:rFonts w:hint="eastAsia"/>
+        </w:rPr>
+        <w:t xml:space="preserve">健檢次數的影響</w:t>
+      </w:r>
+    </w:p>
     <w:p>
       <w:pPr>
         <w:pStyle w:val="FirstParagraph"/>
@@ -1985,329 +2140,6 @@
           <w:rFonts w:hint="eastAsia"/>
         </w:rPr>
         <w:t xml:space="preserve">健檢次數比較實驗顯示，累積更多次健檢紀錄有助於提升預測性能，但效益因疾病而異：</w:t>
-      </w:r>
-    </w:p>
-    <w:p>
-      <w:pPr>
-        <w:numPr>
-          <w:ilvl w:val="0"/>
-          <w:numId w:val="1003"/>
-        </w:numPr>
-      </w:pPr>
-      <w:r>
-        <w:rPr>
-          <w:rFonts w:hint="eastAsia"/>
-          <w:b/>
-          <w:bCs/>
-        </w:rPr>
-        <w:t xml:space="preserve">高血壓受健檢次數影響最大</w:t>
-      </w:r>
-      <w:r>
-        <w:rPr>
-          <w:rFonts w:hint="eastAsia"/>
-        </w:rPr>
-        <w:t xml:space="preserve">：從</w:t>
-      </w:r>
-      <w:r>
-        <w:t xml:space="preserve"> 1 </w:t>
-      </w:r>
-      <w:r>
-        <w:rPr>
-          <w:rFonts w:hint="eastAsia"/>
-        </w:rPr>
-        <w:t xml:space="preserve">次健檢（AUC</w:t>
-      </w:r>
-      <w:r>
-        <w:t xml:space="preserve"> </w:t>
-      </w:r>
-      <w:r>
-        <w:rPr>
-          <w:rFonts w:hint="eastAsia"/>
-        </w:rPr>
-        <w:t xml:space="preserve">0.666）到</w:t>
-      </w:r>
-      <w:r>
-        <w:t xml:space="preserve"> 4 </w:t>
-      </w:r>
-      <w:r>
-        <w:rPr>
-          <w:rFonts w:hint="eastAsia"/>
-        </w:rPr>
-        <w:t xml:space="preserve">次健檢（AUC</w:t>
-      </w:r>
-      <w:r>
-        <w:t xml:space="preserve"> </w:t>
-      </w:r>
-      <w:r>
-        <w:rPr>
-          <w:rFonts w:hint="eastAsia"/>
-        </w:rPr>
-        <w:t xml:space="preserve">0.835），提升幅度達</w:t>
-      </w:r>
-      <w:r>
-        <w:t xml:space="preserve"> 16.9 </w:t>
-      </w:r>
-      <w:r>
-        <w:rPr>
-          <w:rFonts w:hint="eastAsia"/>
-        </w:rPr>
-        <w:t xml:space="preserve">個百分點。特別是從</w:t>
-      </w:r>
-      <w:r>
-        <w:t xml:space="preserve"> 3 </w:t>
-      </w:r>
-      <w:r>
-        <w:rPr>
-          <w:rFonts w:hint="eastAsia"/>
-        </w:rPr>
-        <w:t xml:space="preserve">次到</w:t>
-      </w:r>
-      <w:r>
-        <w:t xml:space="preserve"> 4 </w:t>
-      </w:r>
-      <w:r>
-        <w:rPr>
-          <w:rFonts w:hint="eastAsia"/>
-        </w:rPr>
-        <w:t xml:space="preserve">次的跳躍最為顯著（0.676</w:t>
-      </w:r>
-      <w:r>
-        <w:t xml:space="preserve"> → </w:t>
-      </w:r>
-      <w:r>
-        <w:rPr>
-          <w:rFonts w:hint="eastAsia"/>
-        </w:rPr>
-        <w:t xml:space="preserve">0.835）。診斷分析（§6.7）顯示此跳升主要由最早期健檢的血壓基線驅動——第</w:t>
-      </w:r>
-      <w:r>
-        <w:t xml:space="preserve"> 1 </w:t>
-      </w:r>
-      <w:r>
-        <w:rPr>
-          <w:rFonts w:hint="eastAsia"/>
-        </w:rPr>
-        <w:t xml:space="preserve">次健檢的單獨</w:t>
-      </w:r>
-      <w:r>
-        <w:t xml:space="preserve"> </w:t>
-      </w:r>
-      <w:r>
-        <w:rPr>
-          <w:rFonts w:hint="eastAsia"/>
-        </w:rPr>
-        <w:t xml:space="preserve">AUC（0.786）遠高於後續時間點，且其收縮壓標準化係數為全部特徵中最大。此現象可能反映早期基線與預測目標的時間跨度最長，使模型能捕捉更完整的血壓變化軌跡。然而，此分析僅限於健檢次數</w:t>
-      </w:r>
-      <w:r>
-        <w:t xml:space="preserve"> ≥ 5 </w:t>
-      </w:r>
-      <w:r>
-        <w:rPr>
-          <w:rFonts w:hint="eastAsia"/>
-        </w:rPr>
-        <w:t xml:space="preserve">次的子群（佔</w:t>
-      </w:r>
-      <w:r>
-        <w:t xml:space="preserve"> </w:t>
-      </w:r>
-      <w:r>
-        <w:rPr>
-          <w:rFonts w:hint="eastAsia"/>
-        </w:rPr>
-        <w:t xml:space="preserve">41.7%），外推性需謹慎評估。</w:t>
-      </w:r>
-    </w:p>
-    <w:p>
-      <w:pPr>
-        <w:numPr>
-          <w:ilvl w:val="0"/>
-          <w:numId w:val="1003"/>
-        </w:numPr>
-      </w:pPr>
-      <w:r>
-        <w:rPr>
-          <w:rFonts w:hint="eastAsia"/>
-          <w:b/>
-          <w:bCs/>
-        </w:rPr>
-        <w:t xml:space="preserve">高血糖與高血脂受影響較小</w:t>
-      </w:r>
-      <w:r>
-        <w:rPr>
-          <w:rFonts w:hint="eastAsia"/>
-        </w:rPr>
-        <w:t xml:space="preserve">：高血糖從</w:t>
-      </w:r>
-      <w:r>
-        <w:t xml:space="preserve"> 0.931 </w:t>
-      </w:r>
-      <w:r>
-        <w:rPr>
-          <w:rFonts w:hint="eastAsia"/>
-        </w:rPr>
-        <w:t xml:space="preserve">提升至</w:t>
-      </w:r>
-      <w:r>
-        <w:t xml:space="preserve"> </w:t>
-      </w:r>
-      <w:r>
-        <w:rPr>
-          <w:rFonts w:hint="eastAsia"/>
-        </w:rPr>
-        <w:t xml:space="preserve">0.945（+1.4%），高血脂從</w:t>
-      </w:r>
-      <w:r>
-        <w:t xml:space="preserve"> 0.867 </w:t>
-      </w:r>
-      <w:r>
-        <w:rPr>
-          <w:rFonts w:hint="eastAsia"/>
-        </w:rPr>
-        <w:t xml:space="preserve">提升至</w:t>
-      </w:r>
-      <w:r>
-        <w:t xml:space="preserve"> </w:t>
-      </w:r>
-      <w:r>
-        <w:rPr>
-          <w:rFonts w:hint="eastAsia"/>
-        </w:rPr>
-        <w:t xml:space="preserve">0.882（+1.5%）。這兩項疾病的單次健檢資料已具有高預測力，額外的縱向資料帶來的邊際效益有限。</w:t>
-      </w:r>
-    </w:p>
-    <w:p>
-      <w:pPr>
-        <w:numPr>
-          <w:ilvl w:val="0"/>
-          <w:numId w:val="1003"/>
-        </w:numPr>
-      </w:pPr>
-      <w:r>
-        <w:rPr>
-          <w:rFonts w:hint="eastAsia"/>
-          <w:b/>
-          <w:bCs/>
-        </w:rPr>
-        <w:t xml:space="preserve">縱向資料的不對稱效益</w:t>
-      </w:r>
-      <w:r>
-        <w:rPr>
-          <w:rFonts w:hint="eastAsia"/>
-        </w:rPr>
-        <w:t xml:space="preserve">：健檢次數的增加對不同疾病的預測改善幅度差異甚大，這與特徵重要性分析結果一致——高血壓預測較依賴多個時間點的血壓變化趨勢。</w:t>
-      </w:r>
-    </w:p>
-    <w:p>
-      <w:pPr>
-        <w:pStyle w:val="FirstParagraph"/>
-      </w:pPr>
-      <w:r>
-        <w:rPr>
-          <w:rFonts w:hint="eastAsia"/>
-        </w:rPr>
-        <w:t xml:space="preserve">此結果為鼓勵民眾定期健檢提供了實證支持，尤其對高血壓風險族群而言，持續的縱向追蹤具有更大的預測價值。</w:t>
-      </w:r>
-    </w:p>
-    <w:bookmarkEnd w:id="34"/>
-    <w:bookmarkStart w:id="35" w:name="多任務學習的適用性"/>
-    <w:p>
-      <w:pPr>
-        <w:pStyle w:val="2"/>
-      </w:pPr>
-      <w:r>
-        <w:t xml:space="preserve">7.6 </w:t>
-      </w:r>
-      <w:r>
-        <w:rPr>
-          <w:rFonts w:hint="eastAsia"/>
-        </w:rPr>
-        <w:t xml:space="preserve">多任務學習的適用性</w:t>
-      </w:r>
-    </w:p>
-    <w:p>
-      <w:pPr>
-        <w:pStyle w:val="FirstParagraph"/>
-      </w:pPr>
-      <w:r>
-        <w:t xml:space="preserve">Tsai et al. (2025) </w:t>
-      </w:r>
-      <w:r>
-        <w:rPr>
-          <w:rFonts w:hint="eastAsia"/>
-        </w:rPr>
-        <w:t xml:space="preserve">使用台灣健保資料以多任務學習同時預測四種慢性病（糖尿病、心臟病、中風、高血壓），發現</w:t>
-      </w:r>
-      <w:r>
-        <w:t xml:space="preserve"> MTL </w:t>
-      </w:r>
-      <w:r>
-        <w:rPr>
-          <w:rFonts w:hint="eastAsia"/>
-        </w:rPr>
-        <w:t xml:space="preserve">與</w:t>
-      </w:r>
-      <w:r>
-        <w:t xml:space="preserve"> STL </w:t>
-      </w:r>
-      <w:r>
-        <w:rPr>
-          <w:rFonts w:hint="eastAsia"/>
-        </w:rPr>
-        <w:t xml:space="preserve">效能相當（AUC</w:t>
-      </w:r>
-      <w:r>
-        <w:t xml:space="preserve"> </w:t>
-      </w:r>
-      <w:r>
-        <w:rPr>
-          <w:rFonts w:hint="eastAsia"/>
-        </w:rPr>
-        <w:t xml:space="preserve">差距</w:t>
-      </w:r>
-      <w:r>
-        <w:t xml:space="preserve"> &lt; </w:t>
-      </w:r>
-      <w:r>
-        <w:rPr>
-          <w:rFonts w:hint="eastAsia"/>
-        </w:rPr>
-        <w:t xml:space="preserve">0.01），但</w:t>
-      </w:r>
-      <w:r>
-        <w:t xml:space="preserve"> MTL </w:t>
-      </w:r>
-      <w:r>
-        <w:rPr>
-          <w:rFonts w:hint="eastAsia"/>
-        </w:rPr>
-        <w:t xml:space="preserve">僅需約</w:t>
-      </w:r>
-      <w:r>
-        <w:t xml:space="preserve"> 25% </w:t>
-      </w:r>
-      <w:r>
-        <w:rPr>
-          <w:rFonts w:hint="eastAsia"/>
-        </w:rPr>
-        <w:t xml:space="preserve">的參數量。本研究的</w:t>
-      </w:r>
-      <w:r>
-        <w:t xml:space="preserve"> MTL </w:t>
-      </w:r>
-      <w:r>
-        <w:rPr>
-          <w:rFonts w:hint="eastAsia"/>
-        </w:rPr>
-        <w:t xml:space="preserve">實驗亦呈現類似趨勢——MTL</w:t>
-      </w:r>
-      <w:r>
-        <w:t xml:space="preserve"> </w:t>
-      </w:r>
-      <w:r>
-        <w:rPr>
-          <w:rFonts w:hint="eastAsia"/>
-        </w:rPr>
-        <w:t xml:space="preserve">未能展現預測效能上的優勢，可能原因包括：</w:t>
       </w:r>
     </w:p>
     <w:p>
@@ -2323,31 +2155,85 @@
           <w:b/>
           <w:bCs/>
         </w:rPr>
-        <w:t xml:space="preserve">任務相關性偏低</w:t>
-      </w:r>
-      <w:r>
-        <w:rPr>
-          <w:rFonts w:hint="eastAsia"/>
-        </w:rPr>
-        <w:t xml:space="preserve">：三項疾病的標籤相關性較弱（Phi</w:t>
-      </w:r>
-      <w:r>
-        <w:t xml:space="preserve"> </w:t>
-      </w:r>
-      <w:r>
-        <w:rPr>
-          <w:rFonts w:hint="eastAsia"/>
-        </w:rPr>
-        <w:t xml:space="preserve">係數</w:t>
-      </w:r>
-      <w:r>
-        <w:t xml:space="preserve"> &lt; </w:t>
-      </w:r>
-      <w:r>
-        <w:rPr>
-          <w:rFonts w:hint="eastAsia"/>
-        </w:rPr>
-        <w:t xml:space="preserve">0.1），共享特徵表示無法同時有效服務三項預測目標。</w:t>
+        <w:t xml:space="preserve">高血壓受健檢次數影響最大</w:t>
+      </w:r>
+      <w:r>
+        <w:rPr>
+          <w:rFonts w:hint="eastAsia"/>
+        </w:rPr>
+        <w:t xml:space="preserve">：從</w:t>
+      </w:r>
+      <w:r>
+        <w:t xml:space="preserve"> 1 </w:t>
+      </w:r>
+      <w:r>
+        <w:rPr>
+          <w:rFonts w:hint="eastAsia"/>
+        </w:rPr>
+        <w:t xml:space="preserve">次健檢（AUC</w:t>
+      </w:r>
+      <w:r>
+        <w:t xml:space="preserve"> </w:t>
+      </w:r>
+      <w:r>
+        <w:rPr>
+          <w:rFonts w:hint="eastAsia"/>
+        </w:rPr>
+        <w:t xml:space="preserve">0.666）到</w:t>
+      </w:r>
+      <w:r>
+        <w:t xml:space="preserve"> 4 </w:t>
+      </w:r>
+      <w:r>
+        <w:rPr>
+          <w:rFonts w:hint="eastAsia"/>
+        </w:rPr>
+        <w:t xml:space="preserve">次健檢（AUC</w:t>
+      </w:r>
+      <w:r>
+        <w:t xml:space="preserve"> </w:t>
+      </w:r>
+      <w:r>
+        <w:rPr>
+          <w:rFonts w:hint="eastAsia"/>
+        </w:rPr>
+        <w:t xml:space="preserve">0.835），提升幅度達</w:t>
+      </w:r>
+      <w:r>
+        <w:t xml:space="preserve"> 16.9 </w:t>
+      </w:r>
+      <w:r>
+        <w:rPr>
+          <w:rFonts w:hint="eastAsia"/>
+        </w:rPr>
+        <w:t xml:space="preserve">個百分點。特別是從</w:t>
+      </w:r>
+      <w:r>
+        <w:t xml:space="preserve"> 3 </w:t>
+      </w:r>
+      <w:r>
+        <w:rPr>
+          <w:rFonts w:hint="eastAsia"/>
+        </w:rPr>
+        <w:t xml:space="preserve">次到</w:t>
+      </w:r>
+      <w:r>
+        <w:t xml:space="preserve"> 4 </w:t>
+      </w:r>
+      <w:r>
+        <w:rPr>
+          <w:rFonts w:hint="eastAsia"/>
+        </w:rPr>
+        <w:t xml:space="preserve">次的跳躍最為顯著（0.676</w:t>
+      </w:r>
+      <w:r>
+        <w:t xml:space="preserve"> → </w:t>
+      </w:r>
+      <w:r>
+        <w:rPr>
+          <w:rFonts w:hint="eastAsia"/>
+        </w:rPr>
+        <w:t xml:space="preserve">0.835）。</w:t>
       </w:r>
     </w:p>
     <w:p>
@@ -2363,53 +2249,123 @@
           <w:b/>
           <w:bCs/>
         </w:rPr>
-        <w:t xml:space="preserve">資料規模充足</w:t>
-      </w:r>
-      <w:r>
-        <w:rPr>
-          <w:rFonts w:hint="eastAsia"/>
-        </w:rPr>
-        <w:t xml:space="preserve">：滑動窗口資料集含</w:t>
-      </w:r>
-      <w:r>
-        <w:t xml:space="preserve"> 13,514 </w:t>
-      </w:r>
-      <w:r>
-        <w:rPr>
-          <w:rFonts w:hint="eastAsia"/>
-        </w:rPr>
-        <w:t xml:space="preserve">筆紀錄，各任務已有足夠樣本獨立訓練，MTL</w:t>
-      </w:r>
-      <w:r>
-        <w:t xml:space="preserve"> </w:t>
-      </w:r>
-      <w:r>
-        <w:rPr>
-          <w:rFonts w:hint="eastAsia"/>
-        </w:rPr>
-        <w:t xml:space="preserve">的「資料增強」效益不顯著。</w:t>
-      </w:r>
-    </w:p>
-    <w:p>
-      <w:pPr>
-        <w:numPr>
-          <w:ilvl w:val="0"/>
-          <w:numId w:val="1004"/>
-        </w:numPr>
-      </w:pPr>
-      <w:r>
-        <w:rPr>
-          <w:rFonts w:hint="eastAsia"/>
-          <w:b/>
-          <w:bCs/>
-        </w:rPr>
-        <w:t xml:space="preserve">任務難度不均</w:t>
-      </w:r>
-      <w:r>
-        <w:rPr>
-          <w:rFonts w:hint="eastAsia"/>
-        </w:rPr>
-        <w:t xml:space="preserve">：高血糖</w:t>
+        <w:t xml:space="preserve">高血糖與高血脂受影響較小</w:t>
+      </w:r>
+      <w:r>
+        <w:rPr>
+          <w:rFonts w:hint="eastAsia"/>
+        </w:rPr>
+        <w:t xml:space="preserve">：高血糖從</w:t>
+      </w:r>
+      <w:r>
+        <w:t xml:space="preserve"> 0.931 </w:t>
+      </w:r>
+      <w:r>
+        <w:rPr>
+          <w:rFonts w:hint="eastAsia"/>
+        </w:rPr>
+        <w:t xml:space="preserve">提升至</w:t>
+      </w:r>
+      <w:r>
+        <w:t xml:space="preserve"> </w:t>
+      </w:r>
+      <w:r>
+        <w:rPr>
+          <w:rFonts w:hint="eastAsia"/>
+        </w:rPr>
+        <w:t xml:space="preserve">0.945（+1.4%），高血脂從</w:t>
+      </w:r>
+      <w:r>
+        <w:t xml:space="preserve"> 0.867 </w:t>
+      </w:r>
+      <w:r>
+        <w:rPr>
+          <w:rFonts w:hint="eastAsia"/>
+        </w:rPr>
+        <w:t xml:space="preserve">提升至</w:t>
+      </w:r>
+      <w:r>
+        <w:t xml:space="preserve"> </w:t>
+      </w:r>
+      <w:r>
+        <w:rPr>
+          <w:rFonts w:hint="eastAsia"/>
+        </w:rPr>
+        <w:t xml:space="preserve">0.882（+1.5%）。這兩項疾病的單次健檢資料已具有高預測力，額外的縱向資料帶來的邊際效益有限。</w:t>
+      </w:r>
+    </w:p>
+    <w:bookmarkEnd w:id="34"/>
+    <w:bookmarkStart w:id="35" w:name="各時間點獨立預測力的疾病差異"/>
+    <w:p>
+      <w:pPr>
+        <w:pStyle w:val="3"/>
+      </w:pPr>
+      <w:r>
+        <w:t xml:space="preserve">7.5.2 </w:t>
+      </w:r>
+      <w:r>
+        <w:rPr>
+          <w:rFonts w:hint="eastAsia"/>
+        </w:rPr>
+        <w:t xml:space="preserve">各時間點獨立預測力的疾病差異</w:t>
+      </w:r>
+    </w:p>
+    <w:p>
+      <w:pPr>
+        <w:pStyle w:val="FirstParagraph"/>
+      </w:pPr>
+      <w:r>
+        <w:rPr>
+          <w:rFonts w:hint="eastAsia"/>
+        </w:rPr>
+        <w:t xml:space="preserve">各時間點獨立預測力實驗（§6.7.3）揭示了三項疾病不同的時間依賴模式：</w:t>
+      </w:r>
+    </w:p>
+    <w:p>
+      <w:pPr>
+        <w:pStyle w:val="a0"/>
+      </w:pPr>
+      <w:r>
+        <w:rPr>
+          <w:rFonts w:hint="eastAsia"/>
+        </w:rPr>
+        <w:t xml:space="preserve">高血糖與高血脂皆以</w:t>
+      </w:r>
+      <w:r>
+        <w:t xml:space="preserve"> </w:t>
+      </w:r>
+      <w:r>
+        <w:rPr>
+          <w:rFonts w:hint="eastAsia"/>
+        </w:rPr>
+        <w:t xml:space="preserve">T4（最近時間點）預測力最強（AUC</w:t>
+      </w:r>
+      <w:r>
+        <w:t xml:space="preserve"> </w:t>
+      </w:r>
+      <w:r>
+        <w:rPr>
+          <w:rFonts w:hint="eastAsia"/>
+        </w:rPr>
+        <w:t xml:space="preserve">分別為</w:t>
+      </w:r>
+      <w:r>
+        <w:t xml:space="preserve"> 0.931 </w:t>
+      </w:r>
+      <w:r>
+        <w:rPr>
+          <w:rFonts w:hint="eastAsia"/>
+        </w:rPr>
+        <w:t xml:space="preserve">與</w:t>
+      </w:r>
+      <w:r>
+        <w:t xml:space="preserve"> </w:t>
+      </w:r>
+      <w:r>
+        <w:rPr>
+          <w:rFonts w:hint="eastAsia"/>
+        </w:rPr>
+        <w:t xml:space="preserve">0.867），且</w:t>
       </w:r>
       <w:r>
         <w:t xml:space="preserve"> AUC </w:t>
@@ -2418,25 +2374,200 @@
         <w:rPr>
           <w:rFonts w:hint="eastAsia"/>
         </w:rPr>
-        <w:t xml:space="preserve">高達</w:t>
-      </w:r>
-      <w:r>
-        <w:t xml:space="preserve"> </w:t>
-      </w:r>
-      <w:r>
-        <w:rPr>
-          <w:rFonts w:hint="eastAsia"/>
-        </w:rPr>
-        <w:t xml:space="preserve">0.93，高血壓僅</w:t>
-      </w:r>
-      <w:r>
-        <w:t xml:space="preserve"> </w:t>
-      </w:r>
-      <w:r>
-        <w:rPr>
-          <w:rFonts w:hint="eastAsia"/>
-        </w:rPr>
-        <w:t xml:space="preserve">0.73，難度差距可能導致共享層的梯度被較易任務主導。</w:t>
+        <w:t xml:space="preserve">隨時間點遠離預測目標而遞減，符合「近期值較具預測力」的直覺預期。此模式也與健檢次數實驗中這兩項疾病僅提升約</w:t>
+      </w:r>
+      <w:r>
+        <w:t xml:space="preserve"> 1.5% </w:t>
+      </w:r>
+      <w:r>
+        <w:rPr>
+          <w:rFonts w:hint="eastAsia"/>
+        </w:rPr>
+        <w:t xml:space="preserve">的結果一致——預測力主要由最近期的值決定，加入更多歷史時間點的邊際貢獻有限。</w:t>
+      </w:r>
+    </w:p>
+    <w:p>
+      <w:pPr>
+        <w:pStyle w:val="a0"/>
+      </w:pPr>
+      <w:r>
+        <w:rPr>
+          <w:rFonts w:hint="eastAsia"/>
+        </w:rPr>
+        <w:t xml:space="preserve">高血壓則呈現反直覺的模式：T1（最早時間點）的</w:t>
+      </w:r>
+      <w:r>
+        <w:t xml:space="preserve"> </w:t>
+      </w:r>
+      <w:r>
+        <w:rPr>
+          <w:rFonts w:hint="eastAsia"/>
+        </w:rPr>
+        <w:t xml:space="preserve">AUC（0.786）遠高於</w:t>
+      </w:r>
+      <w:r>
+        <w:t xml:space="preserve"> </w:t>
+      </w:r>
+      <w:r>
+        <w:rPr>
+          <w:rFonts w:hint="eastAsia"/>
+        </w:rPr>
+        <w:t xml:space="preserve">T2-T4（0.627-0.666）。值得注意的是，T2-T4</w:t>
+      </w:r>
+      <w:r>
+        <w:t xml:space="preserve"> </w:t>
+      </w:r>
+      <w:r>
+        <w:rPr>
+          <w:rFonts w:hint="eastAsia"/>
+        </w:rPr>
+        <w:t xml:space="preserve">之間的差異相對較小且呈現非單調變化（T2</w:t>
+      </w:r>
+      <w:r>
+        <w:t xml:space="preserve"> </w:t>
+      </w:r>
+      <w:r>
+        <w:rPr>
+          <w:rFonts w:hint="eastAsia"/>
+        </w:rPr>
+        <w:t xml:space="preserve">最低），顯示此現象並非單純的「越早越好」趨勢，而是</w:t>
+      </w:r>
+      <w:r>
+        <w:t xml:space="preserve"> T1 </w:t>
+      </w:r>
+      <w:r>
+        <w:rPr>
+          <w:rFonts w:hint="eastAsia"/>
+        </w:rPr>
+        <w:t xml:space="preserve">具有某種特殊性。本研究推測此現象可能與入組篩選機制及後續治療干預有關。T1</w:t>
+      </w:r>
+      <w:r>
+        <w:t xml:space="preserve"> </w:t>
+      </w:r>
+      <w:r>
+        <w:rPr>
+          <w:rFonts w:hint="eastAsia"/>
+        </w:rPr>
+        <w:t xml:space="preserve">為世代研究的入組時間點，Luo</w:t>
+      </w:r>
+      <w:r>
+        <w:t xml:space="preserve"> et al. [18] </w:t>
+      </w:r>
+      <w:r>
+        <w:rPr>
+          <w:rFonts w:hint="eastAsia"/>
+        </w:rPr>
+        <w:t xml:space="preserve">的篩選流程排除了</w:t>
+      </w:r>
+      <w:r>
+        <w:t xml:space="preserve"> T1 </w:t>
+      </w:r>
+      <w:r>
+        <w:rPr>
+          <w:rFonts w:hint="eastAsia"/>
+        </w:rPr>
+        <w:t xml:space="preserve">時已確診高血壓（含服用降壓藥物）的個體，因此</w:t>
+      </w:r>
+      <w:r>
+        <w:t xml:space="preserve"> T1 </w:t>
+      </w:r>
+      <w:r>
+        <w:rPr>
+          <w:rFonts w:hint="eastAsia"/>
+        </w:rPr>
+        <w:t xml:space="preserve">的血壓值反映受試者未經藥物干預的自然基線狀態，信號較為純淨。然而，T2</w:t>
+      </w:r>
+      <w:r>
+        <w:t xml:space="preserve"> </w:t>
+      </w:r>
+      <w:r>
+        <w:rPr>
+          <w:rFonts w:hint="eastAsia"/>
+        </w:rPr>
+        <w:t xml:space="preserve">至</w:t>
+      </w:r>
+      <w:r>
+        <w:t xml:space="preserve"> T4 </w:t>
+      </w:r>
+      <w:r>
+        <w:rPr>
+          <w:rFonts w:hint="eastAsia"/>
+        </w:rPr>
+        <w:t xml:space="preserve">期間並未進行二次篩選——部分受試者可能在追蹤期間開始服用降壓藥物，導致其血壓量測值被藥物效果壓低，但其潛在的心血管風險並未消除。當模型以</w:t>
+      </w:r>
+      <w:r>
+        <w:t xml:space="preserve"> T2-T4 </w:t>
+      </w:r>
+      <w:r>
+        <w:rPr>
+          <w:rFonts w:hint="eastAsia"/>
+        </w:rPr>
+        <w:t xml:space="preserve">的血壓值作為輸入特徵時，這些「被治療壓低」的數值降低了模型區分高低風險群體的能力。</w:t>
+      </w:r>
+    </w:p>
+    <w:p>
+      <w:pPr>
+        <w:pStyle w:val="a0"/>
+      </w:pPr>
+      <w:r>
+        <w:rPr>
+          <w:rFonts w:hint="eastAsia"/>
+        </w:rPr>
+        <w:t xml:space="preserve">此假說亦可解釋為何高血糖與高血脂未呈現相同模式：降壓藥物的普及率高且見效迅速（數日至數週即可顯著降低血壓），而降血糖與降血脂藥物的介入效果相對緩慢，對量測值的短期干擾較小，因此血糖與血脂的預測信號在各時間點間維持較一致的遞減趨勢。</w:t>
+      </w:r>
+    </w:p>
+    <w:p>
+      <w:pPr>
+        <w:pStyle w:val="a0"/>
+      </w:pPr>
+      <w:r>
+        <w:rPr>
+          <w:rFonts w:hint="eastAsia"/>
+        </w:rPr>
+        <w:t xml:space="preserve">然而，本資料集不包含用藥紀錄，無法直接驗證上述推測。若</w:t>
+      </w:r>
+      <w:r>
+        <w:t xml:space="preserve"> Luo et al. [18] </w:t>
+      </w:r>
+      <w:r>
+        <w:rPr>
+          <w:rFonts w:hint="eastAsia"/>
+        </w:rPr>
+        <w:t xml:space="preserve">的高血壓定義僅基於量測值（SBP</w:t>
+      </w:r>
+      <w:r>
+        <w:t xml:space="preserve"> ≥ 140 </w:t>
+      </w:r>
+      <w:r>
+        <w:rPr>
+          <w:rFonts w:hint="eastAsia"/>
+        </w:rPr>
+        <w:t xml:space="preserve">或</w:t>
+      </w:r>
+      <w:r>
+        <w:t xml:space="preserve"> DBP ≥ </w:t>
+      </w:r>
+      <w:r>
+        <w:rPr>
+          <w:rFonts w:hint="eastAsia"/>
+        </w:rPr>
+        <w:t xml:space="preserve">90）而不包含用藥狀態，則藥物干預同時壓低了輸入特徵與預測標籤，汙染效應可能較為有限，僅影響藥物未完全控制或中途停藥的個案。此議題值得未來研究在具有用藥紀錄的資料集上進一步驗證。</w:t>
+      </w:r>
+    </w:p>
+    <w:bookmarkEnd w:id="35"/>
+    <w:bookmarkStart w:id="36" w:name="臨床意涵"/>
+    <w:p>
+      <w:pPr>
+        <w:pStyle w:val="3"/>
+      </w:pPr>
+      <w:r>
+        <w:t xml:space="preserve">7.5.3 </w:t>
+      </w:r>
+      <w:r>
+        <w:rPr>
+          <w:rFonts w:hint="eastAsia"/>
+        </w:rPr>
+        <w:t xml:space="preserve">臨床意涵</w:t>
       </w:r>
     </w:p>
     <w:p>
@@ -2447,79 +2578,7 @@
         <w:rPr>
           <w:rFonts w:hint="eastAsia"/>
         </w:rPr>
-        <w:t xml:space="preserve">在本研究的資料集上，MTL</w:t>
-      </w:r>
-      <w:r>
-        <w:t xml:space="preserve"> </w:t>
-      </w:r>
-      <w:r>
-        <w:rPr>
-          <w:rFonts w:hint="eastAsia"/>
-        </w:rPr>
-        <w:t xml:space="preserve">與</w:t>
-      </w:r>
-      <w:r>
-        <w:t xml:space="preserve"> STL </w:t>
-      </w:r>
-      <w:r>
-        <w:rPr>
-          <w:rFonts w:hint="eastAsia"/>
-        </w:rPr>
-        <w:t xml:space="preserve">的預測效能無顯著差異（AUC</w:t>
-      </w:r>
-      <w:r>
-        <w:t xml:space="preserve"> </w:t>
-      </w:r>
-      <w:r>
-        <w:rPr>
-          <w:rFonts w:hint="eastAsia"/>
-        </w:rPr>
-        <w:t xml:space="preserve">差異</w:t>
-      </w:r>
-      <w:r>
-        <w:t xml:space="preserve"> ≤ </w:t>
-      </w:r>
-      <w:r>
-        <w:rPr>
-          <w:rFonts w:hint="eastAsia"/>
-        </w:rPr>
-        <w:t xml:space="preserve">0.8%）。考量到</w:t>
-      </w:r>
-      <w:r>
-        <w:t xml:space="preserve"> STL </w:t>
-      </w:r>
-      <w:r>
-        <w:rPr>
-          <w:rFonts w:hint="eastAsia"/>
-        </w:rPr>
-        <w:t xml:space="preserve">架構更為簡單且效能略優，獨立模型為合理選擇。</w:t>
-      </w:r>
-    </w:p>
-    <w:bookmarkEnd w:id="35"/>
-    <w:bookmarkStart w:id="36" w:name="綜合討論"/>
-    <w:p>
-      <w:pPr>
-        <w:pStyle w:val="2"/>
-      </w:pPr>
-      <w:r>
-        <w:t xml:space="preserve">7.7 </w:t>
-      </w:r>
-      <w:r>
-        <w:rPr>
-          <w:rFonts w:hint="eastAsia"/>
-        </w:rPr>
-        <w:t xml:space="preserve">綜合討論</w:t>
-      </w:r>
-    </w:p>
-    <w:p>
-      <w:pPr>
-        <w:pStyle w:val="FirstParagraph"/>
-      </w:pPr>
-      <w:r>
-        <w:rPr>
-          <w:rFonts w:hint="eastAsia"/>
-        </w:rPr>
-        <w:t xml:space="preserve">綜合以上各項實驗的討論，本研究的核心發現可歸納為以下幾點：</w:t>
+        <w:t xml:space="preserve">綜合兩項實驗的結果：</w:t>
       </w:r>
     </w:p>
     <w:p>
@@ -2535,22 +2594,40 @@
           <w:b/>
           <w:bCs/>
         </w:rPr>
-        <w:t xml:space="preserve">模型效能</w:t>
-      </w:r>
-      <w:r>
-        <w:rPr>
-          <w:rFonts w:hint="eastAsia"/>
-        </w:rPr>
-        <w:t xml:space="preserve">：Logistic</w:t>
-      </w:r>
-      <w:r>
-        <w:t xml:space="preserve"> Regression </w:t>
-      </w:r>
-      <w:r>
-        <w:rPr>
-          <w:rFonts w:hint="eastAsia"/>
-        </w:rPr>
-        <w:t xml:space="preserve">在三項任務中皆表現穩定，簡單的線性模型在結構化健檢資料上已具備與複雜模型相當的排序能力。</w:t>
+        <w:t xml:space="preserve">高血糖與高血脂</w:t>
+      </w:r>
+      <w:r>
+        <w:rPr>
+          <w:rFonts w:hint="eastAsia"/>
+        </w:rPr>
+        <w:t xml:space="preserve">：單次健檢的近期指標即可達到高預測力（AUC</w:t>
+      </w:r>
+      <w:r>
+        <w:t xml:space="preserve"> &gt; </w:t>
+      </w:r>
+      <w:r>
+        <w:rPr>
+          <w:rFonts w:hint="eastAsia"/>
+        </w:rPr>
+        <w:t xml:space="preserve">0.86），對於資源有限的基層醫療單位，近期</w:t>
+      </w:r>
+      <w:r>
+        <w:t xml:space="preserve"> FBG </w:t>
+      </w:r>
+      <w:r>
+        <w:rPr>
+          <w:rFonts w:hint="eastAsia"/>
+        </w:rPr>
+        <w:t xml:space="preserve">或</w:t>
+      </w:r>
+      <w:r>
+        <w:t xml:space="preserve"> TC </w:t>
+      </w:r>
+      <w:r>
+        <w:rPr>
+          <w:rFonts w:hint="eastAsia"/>
+        </w:rPr>
+        <w:t xml:space="preserve">即可進行有效篩檢。</w:t>
       </w:r>
     </w:p>
     <w:p>
@@ -2566,47 +2643,123 @@
           <w:b/>
           <w:bCs/>
         </w:rPr>
-        <w:t xml:space="preserve">特徵重要性</w:t>
-      </w:r>
-      <w:r>
-        <w:rPr>
-          <w:rFonts w:hint="eastAsia"/>
-        </w:rPr>
-        <w:t xml:space="preserve">：疾病特異性明顯，各疾病的最重要預測因子為其對應的診斷指標歷史值。Δ</w:t>
-      </w:r>
-      <w:r>
-        <w:t xml:space="preserve"> </w:t>
-      </w:r>
-      <w:r>
-        <w:rPr>
-          <w:rFonts w:hint="eastAsia"/>
-        </w:rPr>
-        <w:t xml:space="preserve">特徵在</w:t>
-      </w:r>
-      <w:r>
-        <w:t xml:space="preserve"> SHAP Top 10 </w:t>
-      </w:r>
-      <w:r>
-        <w:rPr>
-          <w:rFonts w:hint="eastAsia"/>
-        </w:rPr>
-        <w:t xml:space="preserve">中佔</w:t>
-      </w:r>
-      <w:r>
-        <w:t xml:space="preserve"> </w:t>
-      </w:r>
-      <w:r>
-        <w:rPr>
-          <w:rFonts w:hint="eastAsia"/>
-        </w:rPr>
-        <w:t xml:space="preserve">30-50%，顯示模型確實利用變化量進行決策，其核心價值在於提升臨床可解釋性而非預測效能。</w:t>
+        <w:t xml:space="preserve">高血壓</w:t>
+      </w:r>
+      <w:r>
+        <w:rPr>
+          <w:rFonts w:hint="eastAsia"/>
+        </w:rPr>
+        <w:t xml:space="preserve">：累積更多健檢紀錄可顯著提升預測準確度（+16.9%），支持鼓勵定期健檢的公共衛生政策。然而，各時間點預測力的非單調模式提示此改善的機制可能較為複雜，不宜簡單歸因於「更多資料即更好」。</w:t>
+      </w:r>
+    </w:p>
+    <w:bookmarkEnd w:id="36"/>
+    <w:bookmarkEnd w:id="37"/>
+    <w:bookmarkStart w:id="38" w:name="多任務學習的適用性"/>
+    <w:p>
+      <w:pPr>
+        <w:pStyle w:val="2"/>
+      </w:pPr>
+      <w:r>
+        <w:t xml:space="preserve">7.6 </w:t>
+      </w:r>
+      <w:r>
+        <w:rPr>
+          <w:rFonts w:hint="eastAsia"/>
+        </w:rPr>
+        <w:t xml:space="preserve">多任務學習的適用性</w:t>
+      </w:r>
+    </w:p>
+    <w:p>
+      <w:pPr>
+        <w:pStyle w:val="FirstParagraph"/>
+      </w:pPr>
+      <w:r>
+        <w:t xml:space="preserve">Tsai et al. [27] </w:t>
+      </w:r>
+      <w:r>
+        <w:rPr>
+          <w:rFonts w:hint="eastAsia"/>
+        </w:rPr>
+        <w:t xml:space="preserve">使用台灣健保資料以多任務學習同時預測四種慢性病（糖尿病、心臟病、中風、高血壓），發現</w:t>
+      </w:r>
+      <w:r>
+        <w:t xml:space="preserve"> MTL </w:t>
+      </w:r>
+      <w:r>
+        <w:rPr>
+          <w:rFonts w:hint="eastAsia"/>
+        </w:rPr>
+        <w:t xml:space="preserve">與</w:t>
+      </w:r>
+      <w:r>
+        <w:t xml:space="preserve"> STL </w:t>
+      </w:r>
+      <w:r>
+        <w:rPr>
+          <w:rFonts w:hint="eastAsia"/>
+        </w:rPr>
+        <w:t xml:space="preserve">效能相當（AUC</w:t>
+      </w:r>
+      <w:r>
+        <w:t xml:space="preserve"> </w:t>
+      </w:r>
+      <w:r>
+        <w:rPr>
+          <w:rFonts w:hint="eastAsia"/>
+        </w:rPr>
+        <w:t xml:space="preserve">差距</w:t>
+      </w:r>
+      <w:r>
+        <w:t xml:space="preserve"> &lt; </w:t>
+      </w:r>
+      <w:r>
+        <w:rPr>
+          <w:rFonts w:hint="eastAsia"/>
+        </w:rPr>
+        <w:t xml:space="preserve">0.01），但</w:t>
+      </w:r>
+      <w:r>
+        <w:t xml:space="preserve"> MTL </w:t>
+      </w:r>
+      <w:r>
+        <w:rPr>
+          <w:rFonts w:hint="eastAsia"/>
+        </w:rPr>
+        <w:t xml:space="preserve">僅需約</w:t>
+      </w:r>
+      <w:r>
+        <w:t xml:space="preserve"> 25% </w:t>
+      </w:r>
+      <w:r>
+        <w:rPr>
+          <w:rFonts w:hint="eastAsia"/>
+        </w:rPr>
+        <w:t xml:space="preserve">的參數量。本研究的</w:t>
+      </w:r>
+      <w:r>
+        <w:t xml:space="preserve"> MTL </w:t>
+      </w:r>
+      <w:r>
+        <w:rPr>
+          <w:rFonts w:hint="eastAsia"/>
+        </w:rPr>
+        <w:t xml:space="preserve">實驗亦呈現類似趨勢——MTL</w:t>
+      </w:r>
+      <w:r>
+        <w:t xml:space="preserve"> </w:t>
+      </w:r>
+      <w:r>
+        <w:rPr>
+          <w:rFonts w:hint="eastAsia"/>
+        </w:rPr>
+        <w:t xml:space="preserve">未能展現預測效能上的優勢，可能原因包括：</w:t>
       </w:r>
     </w:p>
     <w:p>
       <w:pPr>
         <w:numPr>
           <w:ilvl w:val="0"/>
-          <w:numId w:val="1005"/>
+          <w:numId w:val="1006"/>
         </w:numPr>
       </w:pPr>
       <w:r>
@@ -2615,38 +2768,38 @@
           <w:b/>
           <w:bCs/>
         </w:rPr>
-        <w:t xml:space="preserve">模型簡化</w:t>
-      </w:r>
-      <w:r>
-        <w:rPr>
-          <w:rFonts w:hint="eastAsia"/>
-        </w:rPr>
-        <w:t xml:space="preserve">：僅需前兩大關鍵特徵即可維持接近完整效能（AUC</w:t>
-      </w:r>
-      <w:r>
-        <w:t xml:space="preserve"> </w:t>
-      </w:r>
-      <w:r>
-        <w:rPr>
-          <w:rFonts w:hint="eastAsia"/>
-        </w:rPr>
-        <w:t xml:space="preserve">降幅在</w:t>
-      </w:r>
-      <w:r>
-        <w:t xml:space="preserve"> 1.5% </w:t>
-      </w:r>
-      <w:r>
-        <w:rPr>
-          <w:rFonts w:hint="eastAsia"/>
-        </w:rPr>
-        <w:t xml:space="preserve">以內），符號回歸的單變數公式亦具有實用的預測力。</w:t>
+        <w:t xml:space="preserve">任務相關性偏低</w:t>
+      </w:r>
+      <w:r>
+        <w:rPr>
+          <w:rFonts w:hint="eastAsia"/>
+        </w:rPr>
+        <w:t xml:space="preserve">：三項疾病的標籤相關性較弱（Phi</w:t>
+      </w:r>
+      <w:r>
+        <w:t xml:space="preserve"> </w:t>
+      </w:r>
+      <w:r>
+        <w:rPr>
+          <w:rFonts w:hint="eastAsia"/>
+        </w:rPr>
+        <w:t xml:space="preserve">係數</w:t>
+      </w:r>
+      <w:r>
+        <w:t xml:space="preserve"> &lt; </w:t>
+      </w:r>
+      <w:r>
+        <w:rPr>
+          <w:rFonts w:hint="eastAsia"/>
+        </w:rPr>
+        <w:t xml:space="preserve">0.1），共享特徵表示無法同時有效服務三項預測目標。</w:t>
       </w:r>
     </w:p>
     <w:p>
       <w:pPr>
         <w:numPr>
           <w:ilvl w:val="0"/>
-          <w:numId w:val="1005"/>
+          <w:numId w:val="1006"/>
         </w:numPr>
       </w:pPr>
       <w:r>
@@ -2655,65 +2808,38 @@
           <w:b/>
           <w:bCs/>
         </w:rPr>
-        <w:t xml:space="preserve">方法穩健性</w:t>
-      </w:r>
-      <w:r>
-        <w:rPr>
-          <w:rFonts w:hint="eastAsia"/>
-        </w:rPr>
-        <w:t xml:space="preserve">：類別不平衡處理方法間無顯著差異，資料篩選策略的</w:t>
-      </w:r>
-      <w:r>
-        <w:t xml:space="preserve"> AUC </w:t>
-      </w:r>
-      <w:r>
-        <w:rPr>
-          <w:rFonts w:hint="eastAsia"/>
-        </w:rPr>
-        <w:t xml:space="preserve">變動</w:t>
-      </w:r>
-      <w:r>
-        <w:t xml:space="preserve"> ≤ </w:t>
-      </w:r>
-      <w:r>
-        <w:rPr>
-          <w:rFonts w:hint="eastAsia"/>
-        </w:rPr>
-        <w:t xml:space="preserve">1.3%，MTL</w:t>
-      </w:r>
-      <w:r>
-        <w:t xml:space="preserve"> </w:t>
-      </w:r>
-      <w:r>
-        <w:rPr>
-          <w:rFonts w:hint="eastAsia"/>
-        </w:rPr>
-        <w:t xml:space="preserve">與</w:t>
-      </w:r>
-      <w:r>
-        <w:t xml:space="preserve"> STL </w:t>
-      </w:r>
-      <w:r>
-        <w:rPr>
-          <w:rFonts w:hint="eastAsia"/>
-        </w:rPr>
-        <w:t xml:space="preserve">差異</w:t>
-      </w:r>
-      <w:r>
-        <w:t xml:space="preserve"> ≤ </w:t>
-      </w:r>
-      <w:r>
-        <w:rPr>
-          <w:rFonts w:hint="eastAsia"/>
-        </w:rPr>
-        <w:t xml:space="preserve">0.8%，多項對比實驗皆驗證了研究方法的穩健性。</w:t>
+        <w:t xml:space="preserve">資料規模充足</w:t>
+      </w:r>
+      <w:r>
+        <w:rPr>
+          <w:rFonts w:hint="eastAsia"/>
+        </w:rPr>
+        <w:t xml:space="preserve">：滑動窗口資料集含</w:t>
+      </w:r>
+      <w:r>
+        <w:t xml:space="preserve"> 13,514 </w:t>
+      </w:r>
+      <w:r>
+        <w:rPr>
+          <w:rFonts w:hint="eastAsia"/>
+        </w:rPr>
+        <w:t xml:space="preserve">筆紀錄，各任務已有足夠樣本獨立訓練，MTL</w:t>
+      </w:r>
+      <w:r>
+        <w:t xml:space="preserve"> </w:t>
+      </w:r>
+      <w:r>
+        <w:rPr>
+          <w:rFonts w:hint="eastAsia"/>
+        </w:rPr>
+        <w:t xml:space="preserve">的「資料增強」效益不顯著。</w:t>
       </w:r>
     </w:p>
     <w:p>
       <w:pPr>
         <w:numPr>
           <w:ilvl w:val="0"/>
-          <w:numId w:val="1005"/>
+          <w:numId w:val="1006"/>
         </w:numPr>
       </w:pPr>
       <w:r>
@@ -2722,13 +2848,13 @@
           <w:b/>
           <w:bCs/>
         </w:rPr>
-        <w:t xml:space="preserve">縱向資料價值</w:t>
-      </w:r>
-      <w:r>
-        <w:rPr>
-          <w:rFonts w:hint="eastAsia"/>
-        </w:rPr>
-        <w:t xml:space="preserve">：累積更多健檢紀錄有助於提升預測性能，尤其對高血壓預測的改善最為顯著（+16.9%）。診斷分析顯示此跳升主要由最早期血壓基線驅動（單獨</w:t>
+        <w:t xml:space="preserve">任務難度不均</w:t>
+      </w:r>
+      <w:r>
+        <w:rPr>
+          <w:rFonts w:hint="eastAsia"/>
+        </w:rPr>
+        <w:t xml:space="preserve">：高血糖</w:t>
       </w:r>
       <w:r>
         <w:t xml:space="preserve"> AUC </w:t>
@@ -2737,14 +2863,351 @@
         <w:rPr>
           <w:rFonts w:hint="eastAsia"/>
         </w:rPr>
-        <w:t xml:space="preserve">0.786），反映早期基線的長期預測價值。此結果支持鼓勵民眾定期健檢的公共衛生政策。</w:t>
+        <w:t xml:space="preserve">高達</w:t>
+      </w:r>
+      <w:r>
+        <w:t xml:space="preserve"> </w:t>
+      </w:r>
+      <w:r>
+        <w:rPr>
+          <w:rFonts w:hint="eastAsia"/>
+        </w:rPr>
+        <w:t xml:space="preserve">0.93，高血壓僅</w:t>
+      </w:r>
+      <w:r>
+        <w:t xml:space="preserve"> </w:t>
+      </w:r>
+      <w:r>
+        <w:rPr>
+          <w:rFonts w:hint="eastAsia"/>
+        </w:rPr>
+        <w:t xml:space="preserve">0.73，難度差距可能導致共享層的梯度被較易任務主導。</w:t>
+      </w:r>
+    </w:p>
+    <w:p>
+      <w:pPr>
+        <w:pStyle w:val="FirstParagraph"/>
+      </w:pPr>
+      <w:r>
+        <w:rPr>
+          <w:rFonts w:hint="eastAsia"/>
+        </w:rPr>
+        <w:t xml:space="preserve">在本研究的資料集上，MTL</w:t>
+      </w:r>
+      <w:r>
+        <w:t xml:space="preserve"> </w:t>
+      </w:r>
+      <w:r>
+        <w:rPr>
+          <w:rFonts w:hint="eastAsia"/>
+        </w:rPr>
+        <w:t xml:space="preserve">與</w:t>
+      </w:r>
+      <w:r>
+        <w:t xml:space="preserve"> STL </w:t>
+      </w:r>
+      <w:r>
+        <w:rPr>
+          <w:rFonts w:hint="eastAsia"/>
+        </w:rPr>
+        <w:t xml:space="preserve">的預測效能無顯著差異（AUC</w:t>
+      </w:r>
+      <w:r>
+        <w:t xml:space="preserve"> </w:t>
+      </w:r>
+      <w:r>
+        <w:rPr>
+          <w:rFonts w:hint="eastAsia"/>
+        </w:rPr>
+        <w:t xml:space="preserve">差異</w:t>
+      </w:r>
+      <w:r>
+        <w:t xml:space="preserve"> ≤ </w:t>
+      </w:r>
+      <w:r>
+        <w:rPr>
+          <w:rFonts w:hint="eastAsia"/>
+        </w:rPr>
+        <w:t xml:space="preserve">0.8%）。考量到</w:t>
+      </w:r>
+      <w:r>
+        <w:t xml:space="preserve"> STL </w:t>
+      </w:r>
+      <w:r>
+        <w:rPr>
+          <w:rFonts w:hint="eastAsia"/>
+        </w:rPr>
+        <w:t xml:space="preserve">架構更為簡單且效能略優，獨立模型為合理選擇。</w:t>
+      </w:r>
+    </w:p>
+    <w:bookmarkEnd w:id="38"/>
+    <w:bookmarkStart w:id="39" w:name="綜合討論"/>
+    <w:p>
+      <w:pPr>
+        <w:pStyle w:val="2"/>
+      </w:pPr>
+      <w:r>
+        <w:t xml:space="preserve">7.7 </w:t>
+      </w:r>
+      <w:r>
+        <w:rPr>
+          <w:rFonts w:hint="eastAsia"/>
+        </w:rPr>
+        <w:t xml:space="preserve">綜合討論</w:t>
+      </w:r>
+    </w:p>
+    <w:p>
+      <w:pPr>
+        <w:pStyle w:val="FirstParagraph"/>
+      </w:pPr>
+      <w:r>
+        <w:rPr>
+          <w:rFonts w:hint="eastAsia"/>
+        </w:rPr>
+        <w:t xml:space="preserve">綜合以上各項實驗的討論，本研究的核心發現可歸納為以下幾點：</w:t>
       </w:r>
     </w:p>
     <w:p>
       <w:pPr>
         <w:numPr>
           <w:ilvl w:val="0"/>
-          <w:numId w:val="1005"/>
+          <w:numId w:val="1007"/>
+        </w:numPr>
+      </w:pPr>
+      <w:r>
+        <w:rPr>
+          <w:rFonts w:hint="eastAsia"/>
+          <w:b/>
+          <w:bCs/>
+        </w:rPr>
+        <w:t xml:space="preserve">模型效能</w:t>
+      </w:r>
+      <w:r>
+        <w:rPr>
+          <w:rFonts w:hint="eastAsia"/>
+        </w:rPr>
+        <w:t xml:space="preserve">：Logistic</w:t>
+      </w:r>
+      <w:r>
+        <w:t xml:space="preserve"> Regression </w:t>
+      </w:r>
+      <w:r>
+        <w:rPr>
+          <w:rFonts w:hint="eastAsia"/>
+        </w:rPr>
+        <w:t xml:space="preserve">在三項任務中皆表現穩定，簡單的線性模型在結構化健檢資料上已具備與複雜模型相當的排序能力。</w:t>
+      </w:r>
+    </w:p>
+    <w:p>
+      <w:pPr>
+        <w:numPr>
+          <w:ilvl w:val="0"/>
+          <w:numId w:val="1007"/>
+        </w:numPr>
+      </w:pPr>
+      <w:r>
+        <w:rPr>
+          <w:rFonts w:hint="eastAsia"/>
+          <w:b/>
+          <w:bCs/>
+        </w:rPr>
+        <w:t xml:space="preserve">特徵重要性</w:t>
+      </w:r>
+      <w:r>
+        <w:rPr>
+          <w:rFonts w:hint="eastAsia"/>
+        </w:rPr>
+        <w:t xml:space="preserve">：疾病特異性明顯，各疾病的最重要預測因子為其對應的診斷指標歷史值。Δ</w:t>
+      </w:r>
+      <w:r>
+        <w:t xml:space="preserve"> </w:t>
+      </w:r>
+      <w:r>
+        <w:rPr>
+          <w:rFonts w:hint="eastAsia"/>
+        </w:rPr>
+        <w:t xml:space="preserve">特徵在</w:t>
+      </w:r>
+      <w:r>
+        <w:t xml:space="preserve"> SHAP Top 10 </w:t>
+      </w:r>
+      <w:r>
+        <w:rPr>
+          <w:rFonts w:hint="eastAsia"/>
+        </w:rPr>
+        <w:t xml:space="preserve">中佔</w:t>
+      </w:r>
+      <w:r>
+        <w:t xml:space="preserve"> </w:t>
+      </w:r>
+      <w:r>
+        <w:rPr>
+          <w:rFonts w:hint="eastAsia"/>
+        </w:rPr>
+        <w:t xml:space="preserve">30-50%，顯示模型確實利用變化量進行決策，其核心價值在於提升臨床可解釋性而非預測效能。</w:t>
+      </w:r>
+    </w:p>
+    <w:p>
+      <w:pPr>
+        <w:numPr>
+          <w:ilvl w:val="0"/>
+          <w:numId w:val="1007"/>
+        </w:numPr>
+      </w:pPr>
+      <w:r>
+        <w:rPr>
+          <w:rFonts w:hint="eastAsia"/>
+          <w:b/>
+          <w:bCs/>
+        </w:rPr>
+        <w:t xml:space="preserve">模型簡化</w:t>
+      </w:r>
+      <w:r>
+        <w:rPr>
+          <w:rFonts w:hint="eastAsia"/>
+        </w:rPr>
+        <w:t xml:space="preserve">：僅需前兩大關鍵特徵即可維持接近完整效能（AUC</w:t>
+      </w:r>
+      <w:r>
+        <w:t xml:space="preserve"> </w:t>
+      </w:r>
+      <w:r>
+        <w:rPr>
+          <w:rFonts w:hint="eastAsia"/>
+        </w:rPr>
+        <w:t xml:space="preserve">降幅在</w:t>
+      </w:r>
+      <w:r>
+        <w:t xml:space="preserve"> 1.5% </w:t>
+      </w:r>
+      <w:r>
+        <w:rPr>
+          <w:rFonts w:hint="eastAsia"/>
+        </w:rPr>
+        <w:t xml:space="preserve">以內），符號回歸的單變數公式亦具有實用的預測力。</w:t>
+      </w:r>
+    </w:p>
+    <w:p>
+      <w:pPr>
+        <w:numPr>
+          <w:ilvl w:val="0"/>
+          <w:numId w:val="1007"/>
+        </w:numPr>
+      </w:pPr>
+      <w:r>
+        <w:rPr>
+          <w:rFonts w:hint="eastAsia"/>
+          <w:b/>
+          <w:bCs/>
+        </w:rPr>
+        <w:t xml:space="preserve">方法穩健性</w:t>
+      </w:r>
+      <w:r>
+        <w:rPr>
+          <w:rFonts w:hint="eastAsia"/>
+        </w:rPr>
+        <w:t xml:space="preserve">：類別不平衡處理方法間無顯著差異，資料篩選策略的</w:t>
+      </w:r>
+      <w:r>
+        <w:t xml:space="preserve"> AUC </w:t>
+      </w:r>
+      <w:r>
+        <w:rPr>
+          <w:rFonts w:hint="eastAsia"/>
+        </w:rPr>
+        <w:t xml:space="preserve">變動</w:t>
+      </w:r>
+      <w:r>
+        <w:t xml:space="preserve"> ≤ </w:t>
+      </w:r>
+      <w:r>
+        <w:rPr>
+          <w:rFonts w:hint="eastAsia"/>
+        </w:rPr>
+        <w:t xml:space="preserve">1.3%，MTL</w:t>
+      </w:r>
+      <w:r>
+        <w:t xml:space="preserve"> </w:t>
+      </w:r>
+      <w:r>
+        <w:rPr>
+          <w:rFonts w:hint="eastAsia"/>
+        </w:rPr>
+        <w:t xml:space="preserve">與</w:t>
+      </w:r>
+      <w:r>
+        <w:t xml:space="preserve"> STL </w:t>
+      </w:r>
+      <w:r>
+        <w:rPr>
+          <w:rFonts w:hint="eastAsia"/>
+        </w:rPr>
+        <w:t xml:space="preserve">差異</w:t>
+      </w:r>
+      <w:r>
+        <w:t xml:space="preserve"> ≤ </w:t>
+      </w:r>
+      <w:r>
+        <w:rPr>
+          <w:rFonts w:hint="eastAsia"/>
+        </w:rPr>
+        <w:t xml:space="preserve">0.8%，多項對比實驗皆驗證了研究方法的穩健性。</w:t>
+      </w:r>
+    </w:p>
+    <w:p>
+      <w:pPr>
+        <w:numPr>
+          <w:ilvl w:val="0"/>
+          <w:numId w:val="1007"/>
+        </w:numPr>
+      </w:pPr>
+      <w:r>
+        <w:rPr>
+          <w:rFonts w:hint="eastAsia"/>
+          <w:b/>
+          <w:bCs/>
+        </w:rPr>
+        <w:t xml:space="preserve">縱向資料價值</w:t>
+      </w:r>
+      <w:r>
+        <w:rPr>
+          <w:rFonts w:hint="eastAsia"/>
+        </w:rPr>
+        <w:t xml:space="preserve">：累積更多健檢紀錄有助於提升預測性能，尤其對高血壓預測的改善最為顯著（+16.9%）。各時間點獨立預測力分析顯示，高血糖與高血脂以最近期值預測力最強，符合直覺預期；高血壓則呈現</w:t>
+      </w:r>
+      <w:r>
+        <w:t xml:space="preserve"> T1 </w:t>
+      </w:r>
+      <w:r>
+        <w:rPr>
+          <w:rFonts w:hint="eastAsia"/>
+        </w:rPr>
+        <w:t xml:space="preserve">預測力最強的反直覺模式（T1</w:t>
+      </w:r>
+      <w:r>
+        <w:t xml:space="preserve"> AUC 0.786 vs T4 AUC </w:t>
+      </w:r>
+      <w:r>
+        <w:rPr>
+          <w:rFonts w:hint="eastAsia"/>
+        </w:rPr>
+        <w:t xml:space="preserve">0.666），推測可能與入組篩選排除用藥者後</w:t>
+      </w:r>
+      <w:r>
+        <w:t xml:space="preserve"> T1 </w:t>
+      </w:r>
+      <w:r>
+        <w:rPr>
+          <w:rFonts w:hint="eastAsia"/>
+        </w:rPr>
+        <w:t xml:space="preserve">信號較為純淨、而後續時間點受降壓藥物干預汙染有關，惟本資料集缺乏用藥紀錄，此假說尚待驗證。</w:t>
+      </w:r>
+    </w:p>
+    <w:p>
+      <w:pPr>
+        <w:numPr>
+          <w:ilvl w:val="0"/>
+          <w:numId w:val="1007"/>
         </w:numPr>
       </w:pPr>
       <w:r>
@@ -2813,7 +3276,7 @@
         <w:rPr>
           <w:rFonts w:hint="eastAsia"/>
         </w:rPr>
-        <w:t xml:space="preserve">最後更新：2026-02-24</w:t>
+        <w:t xml:space="preserve">最後更新：2026-03-24</w:t>
       </w:r>
       <w:r>
         <w:t xml:space="preserve"> </w:t>
@@ -2825,8 +3288,8 @@
         <w:t xml:space="preserve">維護者：紀伯喬</w:t>
       </w:r>
     </w:p>
-    <w:bookmarkEnd w:id="36"/>
-    <w:bookmarkEnd w:id="37"/>
+    <w:bookmarkEnd w:id="39"/>
+    <w:bookmarkEnd w:id="40"/>
     <w:sectPr>
       <w:footnotePr>
         <w:numRestart w:val="eachSect"/>
@@ -3208,6 +3671,91 @@
     </w:lvl>
     <w:lvl w:ilvl="8">
       <w:start w:val="1"/>
+      <w:numFmt w:val="decimal"/>
+      <w:lvlText w:val="%9."/>
+      <w:lvlJc w:val="left"/>
+      <w:pPr>
+        <w:ind w:left="6480" w:hanging="360"/>
+      </w:pPr>
+    </w:lvl>
+  </w:abstractNum>
+  <w:abstractNum w:abstractNumId="99414">
+    <w:nsid w:val="00A99414"/>
+    <w:multiLevelType w:val="multilevel"/>
+    <w:lvl w:ilvl="0">
+      <w:start w:val="4"/>
+      <w:numFmt w:val="decimal"/>
+      <w:lvlText w:val="%1."/>
+      <w:lvlJc w:val="left"/>
+      <w:pPr>
+        <w:ind w:left="720" w:hanging="360"/>
+      </w:pPr>
+    </w:lvl>
+    <w:lvl w:ilvl="1">
+      <w:start w:val="4"/>
+      <w:numFmt w:val="decimal"/>
+      <w:lvlText w:val="%2."/>
+      <w:lvlJc w:val="left"/>
+      <w:pPr>
+        <w:ind w:left="1440" w:hanging="360"/>
+      </w:pPr>
+    </w:lvl>
+    <w:lvl w:ilvl="2">
+      <w:start w:val="4"/>
+      <w:numFmt w:val="decimal"/>
+      <w:lvlText w:val="%3."/>
+      <w:lvlJc w:val="left"/>
+      <w:pPr>
+        <w:ind w:left="2160" w:hanging="360"/>
+      </w:pPr>
+    </w:lvl>
+    <w:lvl w:ilvl="3">
+      <w:start w:val="4"/>
+      <w:numFmt w:val="decimal"/>
+      <w:lvlText w:val="%4."/>
+      <w:lvlJc w:val="left"/>
+      <w:pPr>
+        <w:ind w:left="2880" w:hanging="360"/>
+      </w:pPr>
+    </w:lvl>
+    <w:lvl w:ilvl="4">
+      <w:start w:val="4"/>
+      <w:numFmt w:val="decimal"/>
+      <w:lvlText w:val="%5."/>
+      <w:lvlJc w:val="left"/>
+      <w:pPr>
+        <w:ind w:left="3600" w:hanging="360"/>
+      </w:pPr>
+    </w:lvl>
+    <w:lvl w:ilvl="5">
+      <w:start w:val="4"/>
+      <w:numFmt w:val="decimal"/>
+      <w:lvlText w:val="%6."/>
+      <w:lvlJc w:val="left"/>
+      <w:pPr>
+        <w:ind w:left="4320" w:hanging="360"/>
+      </w:pPr>
+    </w:lvl>
+    <w:lvl w:ilvl="6">
+      <w:start w:val="4"/>
+      <w:numFmt w:val="decimal"/>
+      <w:lvlText w:val="%7."/>
+      <w:lvlJc w:val="left"/>
+      <w:pPr>
+        <w:ind w:left="5040" w:hanging="360"/>
+      </w:pPr>
+    </w:lvl>
+    <w:lvl w:ilvl="7">
+      <w:start w:val="4"/>
+      <w:numFmt w:val="decimal"/>
+      <w:lvlText w:val="%8."/>
+      <w:lvlJc w:val="left"/>
+      <w:pPr>
+        <w:ind w:left="5760" w:hanging="360"/>
+      </w:pPr>
+    </w:lvl>
+    <w:lvl w:ilvl="8">
+      <w:start w:val="4"/>
       <w:numFmt w:val="decimal"/>
       <w:lvlText w:val="%9."/>
       <w:lvlJc w:val="left"/>
@@ -3478,33 +4026,33 @@
     </w:lvlOverride>
   </w:num>
   <w:num w:numId="1002">
-    <w:abstractNumId w:val="99411"/>
+    <w:abstractNumId w:val="99414"/>
     <w:lvlOverride w:ilvl="0">
-      <w:startOverride w:val="1"/>
+      <w:startOverride w:val="4"/>
     </w:lvlOverride>
     <w:lvlOverride w:ilvl="1">
-      <w:startOverride w:val="1"/>
+      <w:startOverride w:val="4"/>
     </w:lvlOverride>
     <w:lvlOverride w:ilvl="2">
-      <w:startOverride w:val="1"/>
+      <w:startOverride w:val="4"/>
     </w:lvlOverride>
     <w:lvlOverride w:ilvl="3">
-      <w:startOverride w:val="1"/>
+      <w:startOverride w:val="4"/>
     </w:lvlOverride>
     <w:lvlOverride w:ilvl="4">
-      <w:startOverride w:val="1"/>
+      <w:startOverride w:val="4"/>
     </w:lvlOverride>
     <w:lvlOverride w:ilvl="5">
-      <w:startOverride w:val="1"/>
+      <w:startOverride w:val="4"/>
     </w:lvlOverride>
     <w:lvlOverride w:ilvl="6">
-      <w:startOverride w:val="1"/>
+      <w:startOverride w:val="4"/>
     </w:lvlOverride>
     <w:lvlOverride w:ilvl="7">
-      <w:startOverride w:val="1"/>
+      <w:startOverride w:val="4"/>
     </w:lvlOverride>
     <w:lvlOverride w:ilvl="8">
-      <w:startOverride w:val="1"/>
+      <w:startOverride w:val="4"/>
     </w:lvlOverride>
   </w:num>
   <w:num w:numId="1003">
@@ -3568,6 +4116,66 @@
     </w:lvlOverride>
   </w:num>
   <w:num w:numId="1005">
+    <w:abstractNumId w:val="99411"/>
+    <w:lvlOverride w:ilvl="0">
+      <w:startOverride w:val="1"/>
+    </w:lvlOverride>
+    <w:lvlOverride w:ilvl="1">
+      <w:startOverride w:val="1"/>
+    </w:lvlOverride>
+    <w:lvlOverride w:ilvl="2">
+      <w:startOverride w:val="1"/>
+    </w:lvlOverride>
+    <w:lvlOverride w:ilvl="3">
+      <w:startOverride w:val="1"/>
+    </w:lvlOverride>
+    <w:lvlOverride w:ilvl="4">
+      <w:startOverride w:val="1"/>
+    </w:lvlOverride>
+    <w:lvlOverride w:ilvl="5">
+      <w:startOverride w:val="1"/>
+    </w:lvlOverride>
+    <w:lvlOverride w:ilvl="6">
+      <w:startOverride w:val="1"/>
+    </w:lvlOverride>
+    <w:lvlOverride w:ilvl="7">
+      <w:startOverride w:val="1"/>
+    </w:lvlOverride>
+    <w:lvlOverride w:ilvl="8">
+      <w:startOverride w:val="1"/>
+    </w:lvlOverride>
+  </w:num>
+  <w:num w:numId="1006">
+    <w:abstractNumId w:val="99411"/>
+    <w:lvlOverride w:ilvl="0">
+      <w:startOverride w:val="1"/>
+    </w:lvlOverride>
+    <w:lvlOverride w:ilvl="1">
+      <w:startOverride w:val="1"/>
+    </w:lvlOverride>
+    <w:lvlOverride w:ilvl="2">
+      <w:startOverride w:val="1"/>
+    </w:lvlOverride>
+    <w:lvlOverride w:ilvl="3">
+      <w:startOverride w:val="1"/>
+    </w:lvlOverride>
+    <w:lvlOverride w:ilvl="4">
+      <w:startOverride w:val="1"/>
+    </w:lvlOverride>
+    <w:lvlOverride w:ilvl="5">
+      <w:startOverride w:val="1"/>
+    </w:lvlOverride>
+    <w:lvlOverride w:ilvl="6">
+      <w:startOverride w:val="1"/>
+    </w:lvlOverride>
+    <w:lvlOverride w:ilvl="7">
+      <w:startOverride w:val="1"/>
+    </w:lvlOverride>
+    <w:lvlOverride w:ilvl="8">
+      <w:startOverride w:val="1"/>
+    </w:lvlOverride>
+  </w:num>
+  <w:num w:numId="1007">
     <w:abstractNumId w:val="99411"/>
     <w:lvlOverride w:ilvl="0">
       <w:startOverride w:val="1"/>

</xml_diff>